<commit_message>
simplificar diagrama de clases
</commit_message>
<xml_diff>
--- a/docs/actividad-2/2_3_REQUERIMIENTOS_PROYECTO_ENLYCE.docx
+++ b/docs/actividad-2/2_3_REQUERIMIENTOS_PROYECTO_ENLYCE.docx
@@ -4221,9 +4221,9 @@
       <w:r>
         <w:drawing>
           <wp:inline distT="0" distB="0" distL="0" distR="0">
-            <wp:extent cx="5143500" cy="6124575"/>
+            <wp:extent cx="5715000" cy="5715000"/>
             <wp:effectExtent t="0" r="0" b="0" l="0"/>
-            <wp:docPr id="1" name="clases-dominio-enlyce.png" descr="Figura 3. Vista conceptual del dominio organizada por agregados." title="Figura 3. Vista conceptual del dominio organizada por agregados."/>
+            <wp:docPr id="1" name="clases-dominio-enlyce.png" descr="Figura 3. Clases principales de ENLYCE organizadas como flujo de negocio." title="Figura 3. Clases principales de ENLYCE organizadas como flujo de negocio."/>
             <wp:cNvGraphicFramePr>
               <a:graphicFrameLocks xmlns:a="http://schemas.openxmlformats.org/drawingml/2006/main" noChangeAspect="1"/>
             </wp:cNvGraphicFramePr>
@@ -4246,7 +4246,7 @@
                   <pic:spPr bwMode="auto">
                     <a:xfrm>
                       <a:off x="0" y="0"/>
-                      <a:ext cx="5143500" cy="6124575"/>
+                      <a:ext cx="5715000" cy="5715000"/>
                     </a:xfrm>
                     <a:prstGeom prst="rect">
                       <a:avLst/>
@@ -4273,7 +4273,7 @@
           <w:sz w:val="18"/>
           <w:szCs w:val="18"/>
         </w:rPr>
-        <w:t xml:space="preserve">Figura 3. Vista conceptual del dominio organizada por agregados.</w:t>
+        <w:t xml:space="preserve">Figura 3. Clases principales de ENLYCE organizadas como flujo de negocio.</w:t>
       </w:r>
     </w:p>
     <w:p>
@@ -4287,7 +4287,7 @@
           <w:sz w:val="21"/>
           <w:szCs w:val="21"/>
         </w:rPr>
-        <w:t xml:space="preserve">Las líneas continuas representan relaciones de agregado configuradas en EF Core. Las punteadas muestran asociaciones conceptuales mediante identificadores. Para conservar la lectura se omiten conexiones secundarias de Asesor con Interacción y Visita; sus identificadores siguen visibles en las clases.</w:t>
+        <w:t xml:space="preserve">Esta vista omite Id y claves foráneas para priorizar el significado del negocio. En el código, Guid representa un identificador único y Guid? indica que ese identificador puede estar vacío.</w:t>
       </w:r>
     </w:p>
     <w:p>

</xml_diff>

<commit_message>
documentar arquitectura de la web publica
</commit_message>
<xml_diff>
--- a/docs/actividad-2/2_3_REQUERIMIENTOS_PROYECTO_ENLYCE.docx
+++ b/docs/actividad-2/2_3_REQUERIMIENTOS_PROYECTO_ENLYCE.docx
@@ -2563,7 +2563,7 @@
                     </pic:cNvPicPr>
                   </pic:nvPicPr>
                   <pic:blipFill>
-                    <a:blip r:embed="rId10" cstate="none"/>
+                    <a:blip r:embed="rId11" cstate="none"/>
                     <a:srcRect/>
                     <a:stretch>
                       <a:fillRect/>
@@ -4144,7 +4144,7 @@
                     </pic:cNvPicPr>
                   </pic:nvPicPr>
                   <pic:blipFill>
-                    <a:blip r:embed="rId11" cstate="none"/>
+                    <a:blip r:embed="rId12" cstate="none"/>
                     <a:srcRect/>
                     <a:stretch>
                       <a:fillRect/>
@@ -4237,7 +4237,7 @@
                     </pic:cNvPicPr>
                   </pic:nvPicPr>
                   <pic:blipFill>
-                    <a:blip r:embed="rId12" cstate="none"/>
+                    <a:blip r:embed="rId13" cstate="none"/>
                     <a:srcRect/>
                     <a:stretch>
                       <a:fillRect/>
@@ -4322,8 +4322,310 @@
         <w:t xml:space="preserve">Documento contrastado contra src/, configuraciones EF Core, endpoints y pruebas de ENLYCE en el commit 13624a7, el 24 de septiembre de 2026. Los cambios locales aún no versionados del módulo administrativo de publicaciones no forman parte de estos diagramas.</w:t>
       </w:r>
     </w:p>
+    <w:p>
+      <w:pPr>
+        <w:sectPr>
+          <w:footerReference w:type="default" r:id="rId9"/>
+          <w:type w:val="nextPage"/>
+          <w:pgSz w:w="12240" w:h="15840" w:orient="portrait"/>
+          <w:pgMar w:top="500" w:right="700" w:bottom="500" w:left="700" w:header="708" w:footer="708" w:gutter="0"/>
+          <w:pgNumType/>
+          <w:docGrid w:linePitch="360"/>
+        </w:sectPr>
+      </w:pPr>
+    </w:p>
+    <w:p>
+      <w:pPr>
+        <w:pStyle w:val="Heading1"/>
+        <w:pBdr>
+          <w:bottom w:val="single" w:color="B08A4B" w:sz="9"/>
+        </w:pBdr>
+        <w:spacing w:after="120" w:before="260"/>
+      </w:pPr>
+      <w:r>
+        <w:rPr>
+          <w:rFonts w:ascii="Times New Roman" w:cs="Times New Roman" w:eastAsia="Times New Roman" w:hAnsi="Times New Roman"/>
+          <w:b/>
+          <w:bCs/>
+          <w:color w:val="742A3A"/>
+        </w:rPr>
+        <w:t xml:space="preserve">Arquitectura de la web pública</w:t>
+      </w:r>
+    </w:p>
+    <w:p>
+      <w:pPr>
+        <w:spacing w:after="100" w:before="120"/>
+        <w:jc w:val="center"/>
+      </w:pPr>
+      <w:r>
+        <w:drawing>
+          <wp:inline distT="0" distB="0" distL="0" distR="0">
+            <wp:extent cx="4953000" cy="5619750"/>
+            <wp:effectExtent t="0" r="0" b="0" l="0"/>
+            <wp:docPr id="1" name="arquitectura-web-publica-enlyce.png" descr="Figura 4. Conexión de la web pública con la API, los datos y las imágenes." title="Figura 4. Conexión de la web pública con la API, los datos y las imágenes."/>
+            <wp:cNvGraphicFramePr>
+              <a:graphicFrameLocks xmlns:a="http://schemas.openxmlformats.org/drawingml/2006/main" noChangeAspect="1"/>
+            </wp:cNvGraphicFramePr>
+            <a:graphic xmlns:a="http://schemas.openxmlformats.org/drawingml/2006/main">
+              <a:graphicData uri="http://schemas.openxmlformats.org/drawingml/2006/picture">
+                <pic:pic xmlns:pic="http://schemas.openxmlformats.org/drawingml/2006/picture">
+                  <pic:nvPicPr>
+                    <pic:cNvPr id="0" name="" descr=""/>
+                    <pic:cNvPicPr>
+                      <a:picLocks noChangeAspect="1" noChangeArrowheads="1"/>
+                    </pic:cNvPicPr>
+                  </pic:nvPicPr>
+                  <pic:blipFill>
+                    <a:blip r:embed="rId14" cstate="none"/>
+                    <a:srcRect/>
+                    <a:stretch>
+                      <a:fillRect/>
+                    </a:stretch>
+                  </pic:blipFill>
+                  <pic:spPr bwMode="auto">
+                    <a:xfrm>
+                      <a:off x="0" y="0"/>
+                      <a:ext cx="4953000" cy="5619750"/>
+                    </a:xfrm>
+                    <a:prstGeom prst="rect">
+                      <a:avLst/>
+                    </a:prstGeom>
+                  </pic:spPr>
+                </pic:pic>
+              </a:graphicData>
+            </a:graphic>
+          </wp:inline>
+        </w:drawing>
+      </w:r>
+    </w:p>
+    <w:p>
+      <w:pPr>
+        <w:spacing w:after="160"/>
+        <w:jc w:val="center"/>
+      </w:pPr>
+      <w:r>
+        <w:rPr>
+          <w:rFonts w:ascii="Times New Roman" w:cs="Times New Roman" w:eastAsia="Times New Roman" w:hAnsi="Times New Roman"/>
+          <w:i/>
+          <w:iCs/>
+          <w:color w:val="655F56"/>
+          <w:sz w:val="18"/>
+          <w:szCs w:val="18"/>
+        </w:rPr>
+        <w:t xml:space="preserve">Figura 4. Conexión de la web pública con la API, los datos y las imágenes.</w:t>
+      </w:r>
+    </w:p>
+    <w:tbl>
+      <w:tblPr>
+        <w:tblW w:type="dxa" w:w="9360"/>
+        <w:tblBorders>
+          <w:top w:val="single" w:color="auto" w:sz="4"/>
+          <w:left w:val="single" w:color="auto" w:sz="4"/>
+          <w:bottom w:val="single" w:color="auto" w:sz="4"/>
+          <w:right w:val="single" w:color="auto" w:sz="4"/>
+          <w:insideH w:val="single" w:color="auto" w:sz="4"/>
+          <w:insideV w:val="single" w:color="auto" w:sz="4"/>
+        </w:tblBorders>
+      </w:tblPr>
+      <w:tblGrid>
+        <w:gridCol w:w="2300"/>
+        <w:gridCol w:w="7060"/>
+      </w:tblGrid>
+      <w:tr>
+        <w:tc>
+          <w:tcPr>
+            <w:tcW w:type="dxa" w:w="2300"/>
+            <w:tcBorders>
+              <w:top w:val="single" w:color="C9BFAE" w:sz="5"/>
+              <w:left w:val="single" w:color="C9BFAE" w:sz="5"/>
+              <w:bottom w:val="single" w:color="C9BFAE" w:sz="5"/>
+              <w:right w:val="single" w:color="C9BFAE" w:sz="5"/>
+            </w:tcBorders>
+            <w:shd w:fill="E4ECE6" w:color="auto" w:val="clear"/>
+            <w:tcMar>
+              <w:top w:type="dxa" w:w="90"/>
+              <w:left w:type="dxa" w:w="100"/>
+              <w:bottom w:type="dxa" w:w="90"/>
+              <w:right w:type="dxa" w:w="100"/>
+            </w:tcMar>
+          </w:tcPr>
+          <w:p>
+            <w:r>
+              <w:rPr>
+                <w:rFonts w:ascii="Times New Roman" w:cs="Times New Roman" w:eastAsia="Times New Roman" w:hAnsi="Times New Roman"/>
+                <w:b/>
+                <w:bCs/>
+                <w:color w:val="26352F"/>
+                <w:sz w:val="21"/>
+                <w:szCs w:val="21"/>
+              </w:rPr>
+              <w:t xml:space="preserve">Consultar inmuebles</w:t>
+            </w:r>
+          </w:p>
+        </w:tc>
+        <w:tc>
+          <w:tcPr>
+            <w:tcW w:type="dxa" w:w="7060"/>
+            <w:tcBorders>
+              <w:top w:val="single" w:color="C9BFAE" w:sz="5"/>
+              <w:left w:val="single" w:color="C9BFAE" w:sz="5"/>
+              <w:bottom w:val="single" w:color="C9BFAE" w:sz="5"/>
+              <w:right w:val="single" w:color="C9BFAE" w:sz="5"/>
+            </w:tcBorders>
+            <w:tcMar>
+              <w:top w:type="dxa" w:w="90"/>
+              <w:left w:type="dxa" w:w="100"/>
+              <w:bottom w:type="dxa" w:w="90"/>
+              <w:right w:type="dxa" w:w="100"/>
+            </w:tcMar>
+          </w:tcPr>
+          <w:p>
+            <w:pPr>
+              <w:spacing w:after="0"/>
+            </w:pPr>
+            <w:r>
+              <w:rPr>
+                <w:rFonts w:ascii="Times New Roman" w:cs="Times New Roman" w:eastAsia="Times New Roman" w:hAnsi="Times New Roman"/>
+                <w:color w:val="26352F"/>
+                <w:sz w:val="21"/>
+                <w:szCs w:val="21"/>
+              </w:rPr>
+              <w:t xml:space="preserve">El visitante navega por catálogo y fichas. Next.js consulta la API y esta lee únicamente las publicaciones disponibles en PostgreSQL.</w:t>
+            </w:r>
+          </w:p>
+        </w:tc>
+      </w:tr>
+      <w:tr>
+        <w:tc>
+          <w:tcPr>
+            <w:tcW w:type="dxa" w:w="2300"/>
+            <w:tcBorders>
+              <w:top w:val="single" w:color="C9BFAE" w:sz="5"/>
+              <w:left w:val="single" w:color="C9BFAE" w:sz="5"/>
+              <w:bottom w:val="single" w:color="C9BFAE" w:sz="5"/>
+              <w:right w:val="single" w:color="C9BFAE" w:sz="5"/>
+            </w:tcBorders>
+            <w:shd w:fill="E4ECE6" w:color="auto" w:val="clear"/>
+            <w:tcMar>
+              <w:top w:type="dxa" w:w="90"/>
+              <w:left w:type="dxa" w:w="100"/>
+              <w:bottom w:type="dxa" w:w="90"/>
+              <w:right w:type="dxa" w:w="100"/>
+            </w:tcMar>
+          </w:tcPr>
+          <w:p>
+            <w:r>
+              <w:rPr>
+                <w:rFonts w:ascii="Times New Roman" w:cs="Times New Roman" w:eastAsia="Times New Roman" w:hAnsi="Times New Roman"/>
+                <w:b/>
+                <w:bCs/>
+                <w:color w:val="26352F"/>
+                <w:sz w:val="21"/>
+                <w:szCs w:val="21"/>
+              </w:rPr>
+              <w:t xml:space="preserve">Solicitar información</w:t>
+            </w:r>
+          </w:p>
+        </w:tc>
+        <w:tc>
+          <w:tcPr>
+            <w:tcW w:type="dxa" w:w="7060"/>
+            <w:tcBorders>
+              <w:top w:val="single" w:color="C9BFAE" w:sz="5"/>
+              <w:left w:val="single" w:color="C9BFAE" w:sz="5"/>
+              <w:bottom w:val="single" w:color="C9BFAE" w:sz="5"/>
+              <w:right w:val="single" w:color="C9BFAE" w:sz="5"/>
+            </w:tcBorders>
+            <w:tcMar>
+              <w:top w:type="dxa" w:w="90"/>
+              <w:left w:type="dxa" w:w="100"/>
+              <w:bottom w:type="dxa" w:w="90"/>
+              <w:right w:type="dxa" w:w="100"/>
+            </w:tcMar>
+          </w:tcPr>
+          <w:p>
+            <w:pPr>
+              <w:spacing w:after="0"/>
+            </w:pPr>
+            <w:r>
+              <w:rPr>
+                <w:rFonts w:ascii="Times New Roman" w:cs="Times New Roman" w:eastAsia="Times New Roman" w:hAnsi="Times New Roman"/>
+                <w:color w:val="26352F"/>
+                <w:sz w:val="21"/>
+                <w:szCs w:val="21"/>
+              </w:rPr>
+              <w:t xml:space="preserve">El formulario consulta la política de datos y envía la solicitud. La API valida y guarda una oportunidad comercial con su consentimiento.</w:t>
+            </w:r>
+          </w:p>
+        </w:tc>
+      </w:tr>
+      <w:tr>
+        <w:tc>
+          <w:tcPr>
+            <w:tcW w:type="dxa" w:w="2300"/>
+            <w:tcBorders>
+              <w:top w:val="single" w:color="C9BFAE" w:sz="5"/>
+              <w:left w:val="single" w:color="C9BFAE" w:sz="5"/>
+              <w:bottom w:val="single" w:color="C9BFAE" w:sz="5"/>
+              <w:right w:val="single" w:color="C9BFAE" w:sz="5"/>
+            </w:tcBorders>
+            <w:shd w:fill="E4ECE6" w:color="auto" w:val="clear"/>
+            <w:tcMar>
+              <w:top w:type="dxa" w:w="90"/>
+              <w:left w:type="dxa" w:w="100"/>
+              <w:bottom w:type="dxa" w:w="90"/>
+              <w:right w:type="dxa" w:w="100"/>
+            </w:tcMar>
+          </w:tcPr>
+          <w:p>
+            <w:r>
+              <w:rPr>
+                <w:rFonts w:ascii="Times New Roman" w:cs="Times New Roman" w:eastAsia="Times New Roman" w:hAnsi="Times New Roman"/>
+                <w:b/>
+                <w:bCs/>
+                <w:color w:val="26352F"/>
+                <w:sz w:val="21"/>
+                <w:szCs w:val="21"/>
+              </w:rPr>
+              <w:t xml:space="preserve">Frontera importante</w:t>
+            </w:r>
+          </w:p>
+        </w:tc>
+        <w:tc>
+          <w:tcPr>
+            <w:tcW w:type="dxa" w:w="7060"/>
+            <w:tcBorders>
+              <w:top w:val="single" w:color="C9BFAE" w:sz="5"/>
+              <w:left w:val="single" w:color="C9BFAE" w:sz="5"/>
+              <w:bottom w:val="single" w:color="C9BFAE" w:sz="5"/>
+              <w:right w:val="single" w:color="C9BFAE" w:sz="5"/>
+            </w:tcBorders>
+            <w:tcMar>
+              <w:top w:type="dxa" w:w="90"/>
+              <w:left w:type="dxa" w:w="100"/>
+              <w:bottom w:type="dxa" w:w="90"/>
+              <w:right w:type="dxa" w:w="100"/>
+            </w:tcMar>
+          </w:tcPr>
+          <w:p>
+            <w:pPr>
+              <w:spacing w:after="0"/>
+            </w:pPr>
+            <w:r>
+              <w:rPr>
+                <w:rFonts w:ascii="Times New Roman" w:cs="Times New Roman" w:eastAsia="Times New Roman" w:hAnsi="Times New Roman"/>
+                <w:color w:val="26352F"/>
+                <w:sz w:val="21"/>
+                <w:szCs w:val="21"/>
+              </w:rPr>
+              <w:t xml:space="preserve">La web nunca accede directamente a PostgreSQL ni al almacenamiento de imágenes; toda operación pasa por la API de ENLYCE.</w:t>
+            </w:r>
+          </w:p>
+        </w:tc>
+      </w:tr>
+    </w:tbl>
     <w:sectPr>
-      <w:footerReference w:type="default" r:id="rId9"/>
+      <w:footerReference w:type="default" r:id="rId10"/>
       <w:type w:val="nextPage"/>
       <w:pgSz w:w="12240" w:h="15840" w:orient="portrait"/>
       <w:pgMar w:top="500" w:right="700" w:bottom="500" w:left="700" w:header="708" w:footer="708" w:gutter="0"/>
@@ -4438,6 +4740,37 @@
 </file>
 
 <file path=word/footer3.xml><?xml version="1.0" encoding="utf-8"?>
+<w:ftr xmlns:wpc="http://schemas.microsoft.com/office/word/2010/wordprocessingCanvas" xmlns:mc="http://schemas.openxmlformats.org/markup-compatibility/2006" xmlns:o="urn:schemas-microsoft-com:office:office" xmlns:r="http://schemas.openxmlformats.org/officeDocument/2006/relationships" xmlns:m="http://schemas.openxmlformats.org/officeDocument/2006/math" xmlns:v="urn:schemas-microsoft-com:vml" xmlns:wp14="http://schemas.microsoft.com/office/word/2010/wordprocessingDrawing" xmlns:wp="http://schemas.openxmlformats.org/drawingml/2006/wordprocessingDrawing" xmlns:w10="urn:schemas-microsoft-com:office:word" xmlns:w="http://schemas.openxmlformats.org/wordprocessingml/2006/main" xmlns:w14="http://schemas.microsoft.com/office/word/2010/wordml" xmlns:w15="http://schemas.microsoft.com/office/word/2012/wordml" xmlns:wpg="http://schemas.microsoft.com/office/word/2010/wordprocessingGroup" xmlns:wpi="http://schemas.microsoft.com/office/word/2010/wordprocessingInk" xmlns:wne="http://schemas.microsoft.com/office/word/2006/wordml" xmlns:wps="http://schemas.microsoft.com/office/word/2010/wordprocessingShape">
+  <w:p>
+    <w:pPr>
+      <w:jc w:val="center"/>
+    </w:pPr>
+    <w:r>
+      <w:rPr>
+        <w:rFonts w:ascii="Times New Roman" w:cs="Times New Roman" w:eastAsia="Times New Roman" w:hAnsi="Times New Roman"/>
+        <w:color w:val="655F56"/>
+        <w:sz w:val="18"/>
+        <w:szCs w:val="18"/>
+      </w:rPr>
+      <w:t xml:space="preserve">ENLYCE · Taller práctico UML · </w:t>
+    </w:r>
+    <w:r>
+      <w:rPr>
+        <w:rFonts w:ascii="Times New Roman" w:cs="Times New Roman" w:eastAsia="Times New Roman" w:hAnsi="Times New Roman"/>
+        <w:color w:val="655F56"/>
+        <w:sz w:val="18"/>
+        <w:szCs w:val="18"/>
+      </w:rPr>
+      <w:fldChar w:fldCharType="begin"/>
+      <w:instrText xml:space="preserve">PAGE</w:instrText>
+      <w:fldChar w:fldCharType="separate"/>
+      <w:fldChar w:fldCharType="end"/>
+    </w:r>
+  </w:p>
+</w:ftr>
+</file>
+
+<file path=word/footer4.xml><?xml version="1.0" encoding="utf-8"?>
 <w:ftr xmlns:wpc="http://schemas.microsoft.com/office/word/2010/wordprocessingCanvas" xmlns:mc="http://schemas.openxmlformats.org/markup-compatibility/2006" xmlns:o="urn:schemas-microsoft-com:office:office" xmlns:r="http://schemas.openxmlformats.org/officeDocument/2006/relationships" xmlns:m="http://schemas.openxmlformats.org/officeDocument/2006/math" xmlns:v="urn:schemas-microsoft-com:vml" xmlns:wp14="http://schemas.microsoft.com/office/word/2010/wordprocessingDrawing" xmlns:wp="http://schemas.openxmlformats.org/drawingml/2006/wordprocessingDrawing" xmlns:w10="urn:schemas-microsoft-com:office:word" xmlns:w="http://schemas.openxmlformats.org/wordprocessingml/2006/main" xmlns:w14="http://schemas.microsoft.com/office/word/2010/wordml" xmlns:w15="http://schemas.microsoft.com/office/word/2012/wordml" xmlns:wpg="http://schemas.microsoft.com/office/word/2010/wordprocessingGroup" xmlns:wpi="http://schemas.microsoft.com/office/word/2010/wordprocessingInk" xmlns:wne="http://schemas.microsoft.com/office/word/2006/wordml" xmlns:wps="http://schemas.microsoft.com/office/word/2010/wordprocessingShape">
   <w:p>
     <w:pPr>

</xml_diff>